<commit_message>
anotehr lecture fix attempt 9999999
</commit_message>
<xml_diff>
--- a/docs/lectures/lecture_16/16_01_lecture_powerpoint.docx
+++ b/docs/lectures/lecture_16/16_01_lecture_powerpoint.docx
@@ -18465,7 +18465,7 @@
         <w:rPr>
           <w:rStyle w:val="DocumentationTok"/>
         </w:rPr>
-        <w:t xml:space="preserve">## Model     1    47.72 0.10517 5.6414  0.003 **</w:t>
+        <w:t xml:space="preserve">## Model     1    47.72 0.10517 5.6414  0.004 **</w:t>
       </w:r>
       <w:r>
         <w:br/>
@@ -18609,7 +18609,7 @@
         <w:rPr>
           <w:rStyle w:val="DocumentationTok"/>
         </w:rPr>
-        <w:t xml:space="preserve">## Model     1    26.24 0.06493 3.3333  0.018 *</w:t>
+        <w:t xml:space="preserve">## Model     1    26.24 0.06493 3.3333  0.013 *</w:t>
       </w:r>
       <w:r>
         <w:br/>
@@ -19106,7 +19106,7 @@
         <w:rPr>
           <w:rStyle w:val="DocumentationTok"/>
         </w:rPr>
-        <w:t xml:space="preserve">## LEH 0.108 0.006 -    </w:t>
+        <w:t xml:space="preserve">## LEH 0.090 0.006 -    </w:t>
       </w:r>
       <w:r>
         <w:br/>
@@ -19115,7 +19115,7 @@
         <w:rPr>
           <w:rStyle w:val="DocumentationTok"/>
         </w:rPr>
-        <w:t xml:space="preserve">## TJH 0.006 0.006 0.018</w:t>
+        <w:t xml:space="preserve">## TJH 0.006 0.006 0.024</w:t>
       </w:r>
       <w:r>
         <w:br/>

</xml_diff>